<commit_message>
nộp bài tập Exercise1
</commit_message>
<xml_diff>
--- a/slot1/Exercise 1.docx
+++ b/slot1/Exercise 1.docx
@@ -49,35 +49,7 @@
             <w:rStyle w:val="Hyperlink"/>
             <w:noProof/>
           </w:rPr>
-          <w:t>G</w:t>
-        </w:r>
-        <w:r>
-          <w:rPr>
-            <w:rStyle w:val="Hyperlink"/>
-            <w:noProof/>
-          </w:rPr>
-          <w:t>i</w:t>
-        </w:r>
-        <w:r>
-          <w:rPr>
-            <w:rStyle w:val="Hyperlink"/>
-            <w:noProof/>
-          </w:rPr>
-          <w:t>ải th</w:t>
-        </w:r>
-        <w:r>
-          <w:rPr>
-            <w:rStyle w:val="Hyperlink"/>
-            <w:noProof/>
-          </w:rPr>
-          <w:t>í</w:t>
-        </w:r>
-        <w:r>
-          <w:rPr>
-            <w:rStyle w:val="Hyperlink"/>
-            <w:noProof/>
-          </w:rPr>
-          <w:t>ch sự khác nhau của Spring và Spring Boot</w:t>
+          <w:t>Giải thích sự khác nhau của Spring và Spring Boot</w:t>
         </w:r>
         <w:r>
           <w:rPr>
@@ -118,7 +90,7 @@
             <w:noProof/>
             <w:webHidden/>
           </w:rPr>
-          <w:t>2</w:t>
+          <w:t>3</w:t>
         </w:r>
         <w:r>
           <w:rPr>
@@ -200,7 +172,7 @@
             <w:noProof/>
             <w:webHidden/>
           </w:rPr>
-          <w:t>3</w:t>
+          <w:t>4</w:t>
         </w:r>
         <w:r>
           <w:rPr>
@@ -270,7 +242,7 @@
             <w:noProof/>
             <w:webHidden/>
           </w:rPr>
-          <w:t>3</w:t>
+          <w:t>4</w:t>
         </w:r>
         <w:r>
           <w:rPr>
@@ -340,7 +312,7 @@
             <w:noProof/>
             <w:webHidden/>
           </w:rPr>
-          <w:t>3</w:t>
+          <w:t>4</w:t>
         </w:r>
         <w:r>
           <w:rPr>
@@ -421,7 +393,7 @@
             <w:noProof/>
             <w:webHidden/>
           </w:rPr>
-          <w:t>4</w:t>
+          <w:t>5</w:t>
         </w:r>
         <w:r>
           <w:rPr>
@@ -491,7 +463,7 @@
             <w:noProof/>
             <w:webHidden/>
           </w:rPr>
-          <w:t>4</w:t>
+          <w:t>5</w:t>
         </w:r>
         <w:r>
           <w:rPr>
@@ -561,7 +533,7 @@
             <w:noProof/>
             <w:webHidden/>
           </w:rPr>
-          <w:t>5</w:t>
+          <w:t>6</w:t>
         </w:r>
         <w:r>
           <w:rPr>
@@ -571,6 +543,21 @@
           <w:fldChar w:fldCharType="end"/>
         </w:r>
       </w:hyperlink>
+    </w:p>
+    <w:p>
+      <w:r>
+        <w:fldChar w:fldCharType="end"/>
+      </w:r>
+    </w:p>
+    <w:p>
+      <w:pPr>
+        <w:spacing w:before="0" w:after="0" w:line="240" w:lineRule="auto"/>
+        <w:jc w:val="left"/>
+        <w:outlineLvl w:val="9"/>
+      </w:pPr>
+      <w:r>
+        <w:br w:type="page"/>
+      </w:r>
     </w:p>
     <w:p>
       <w:pPr>
@@ -581,13 +568,11 @@
         </w:rPr>
       </w:pPr>
       <w:r>
-        <w:fldChar w:fldCharType="end"/>
-      </w:r>
-      <w:r>
         <w:rPr>
           <w:b/>
           <w:bCs/>
         </w:rPr>
+        <w:lastRenderedPageBreak/>
         <w:t>MỤC</w:t>
       </w:r>
       <w:r>
@@ -638,26 +623,12 @@
             <w:rStyle w:val="Hyperlink"/>
             <w:noProof/>
           </w:rPr>
-          <w:t>Hình</w:t>
+          <w:t>Hình 1</w:t>
         </w:r>
         <w:r>
           <w:rPr>
             <w:rStyle w:val="Hyperlink"/>
             <w:noProof/>
-          </w:rPr>
-          <w:t xml:space="preserve"> </w:t>
-        </w:r>
-        <w:r>
-          <w:rPr>
-            <w:rStyle w:val="Hyperlink"/>
-            <w:noProof/>
-          </w:rPr>
-          <w:t>1</w:t>
-        </w:r>
-        <w:r>
-          <w:rPr>
-            <w:rStyle w:val="Hyperlink"/>
-            <w:noProof/>
             <w:lang w:val="vi-VN"/>
           </w:rPr>
           <w:t>: Ví dụ minh họa ORM(JDBC)</w:t>
@@ -701,7 +672,7 @@
             <w:noProof/>
             <w:webHidden/>
           </w:rPr>
-          <w:t>4</w:t>
+          <w:t>5</w:t>
         </w:r>
         <w:r>
           <w:rPr>
@@ -779,7 +750,7 @@
             <w:noProof/>
             <w:webHidden/>
           </w:rPr>
-          <w:t>4</w:t>
+          <w:t>5</w:t>
         </w:r>
         <w:r>
           <w:rPr>
@@ -857,7 +828,7 @@
             <w:noProof/>
             <w:webHidden/>
           </w:rPr>
-          <w:t>5</w:t>
+          <w:t>6</w:t>
         </w:r>
         <w:r>
           <w:rPr>
@@ -935,7 +906,7 @@
             <w:noProof/>
             <w:webHidden/>
           </w:rPr>
-          <w:t>6</w:t>
+          <w:t>7</w:t>
         </w:r>
         <w:r>
           <w:rPr>
@@ -1013,7 +984,7 @@
             <w:noProof/>
             <w:webHidden/>
           </w:rPr>
-          <w:t>6</w:t>
+          <w:t>7</w:t>
         </w:r>
         <w:r>
           <w:rPr>
@@ -1091,7 +1062,7 @@
             <w:noProof/>
             <w:webHidden/>
           </w:rPr>
-          <w:t>7</w:t>
+          <w:t>8</w:t>
         </w:r>
         <w:r>
           <w:rPr>
@@ -2082,6 +2053,7 @@
         <w:ind w:left="432"/>
         <w:rPr>
           <w:szCs w:val="24"/>
+          <w:lang w:val="vi-VN"/>
         </w:rPr>
       </w:pPr>
       <w:r>
@@ -2182,6 +2154,7 @@
       <w:r>
         <w:rPr>
           <w:szCs w:val="24"/>
+          <w:lang w:val="vi-VN"/>
         </w:rPr>
         <w:t>ORM cho phép lập trình viên thao tác với object thay vì viết câu lệnh SQL thủ công.</w:t>
       </w:r>
@@ -2194,6 +2167,7 @@
         <w:jc w:val="left"/>
         <w:rPr>
           <w:szCs w:val="24"/>
+          <w:lang w:val="vi-VN"/>
         </w:rPr>
       </w:pPr>
       <w:r>
@@ -2210,6 +2184,7 @@
           <w:b/>
           <w:bCs/>
           <w:szCs w:val="24"/>
+          <w:lang w:val="vi-VN"/>
         </w:rPr>
         <w:t>ORM sẽ tự động:</w:t>
       </w:r>
@@ -2223,6 +2198,7 @@
       <w:r>
         <w:rPr>
           <w:szCs w:val="24"/>
+          <w:lang w:val="vi-VN"/>
         </w:rPr>
         <w:t xml:space="preserve">chuyển object thành câu lệnh SQL, thực hiện truy vấn, ánh xạ dữ liệu từ database về object. </w:t>
       </w:r>
@@ -2234,6 +2210,7 @@
         <w:ind w:left="432"/>
         <w:rPr>
           <w:szCs w:val="24"/>
+          <w:lang w:val="vi-VN"/>
         </w:rPr>
       </w:pPr>
     </w:p>
@@ -2618,24 +2595,14 @@
       <w:r>
         <w:t xml:space="preserve">Hình </w:t>
       </w:r>
-      <w:r>
-        <w:fldChar w:fldCharType="begin"/>
-      </w:r>
-      <w:r>
-        <w:instrText xml:space="preserve"> SEQ Hình \* ARABIC </w:instrText>
-      </w:r>
-      <w:r>
-        <w:fldChar w:fldCharType="separate"/>
-      </w:r>
-      <w:r>
-        <w:rPr>
-          <w:noProof/>
-        </w:rPr>
-        <w:t>1</w:t>
-      </w:r>
-      <w:r>
-        <w:fldChar w:fldCharType="end"/>
-      </w:r>
+      <w:fldSimple w:instr=" SEQ Hình \* ARABIC ">
+        <w:r>
+          <w:rPr>
+            <w:noProof/>
+          </w:rPr>
+          <w:t>1</w:t>
+        </w:r>
+      </w:fldSimple>
       <w:r>
         <w:rPr>
           <w:lang w:val="vi-VN"/>
@@ -2825,12 +2792,18 @@
       </w:pPr>
       <w:bookmarkStart w:id="9" w:name="_Toc229669773"/>
       <w:r>
+        <w:rPr>
+          <w:lang w:val="vi-VN"/>
+        </w:rPr>
         <w:t xml:space="preserve">Hình </w:t>
       </w:r>
       <w:r>
         <w:fldChar w:fldCharType="begin"/>
       </w:r>
       <w:r>
+        <w:rPr>
+          <w:lang w:val="vi-VN"/>
+        </w:rPr>
         <w:instrText xml:space="preserve"> SEQ Hình \* ARABIC </w:instrText>
       </w:r>
       <w:r>
@@ -2839,6 +2812,7 @@
       <w:r>
         <w:rPr>
           <w:noProof/>
+          <w:lang w:val="vi-VN"/>
         </w:rPr>
         <w:t>2</w:t>
       </w:r>
@@ -2860,11 +2834,13 @@
         <w:ind w:left="432"/>
         <w:rPr>
           <w:szCs w:val="24"/>
-        </w:rPr>
-      </w:pPr>
-      <w:r>
-        <w:rPr>
-          <w:szCs w:val="24"/>
+          <w:lang w:val="vi-VN"/>
+        </w:rPr>
+      </w:pPr>
+      <w:r>
+        <w:rPr>
+          <w:szCs w:val="24"/>
+          <w:lang w:val="vi-VN"/>
         </w:rPr>
         <w:t>ORM sẽ tự động:</w:t>
       </w:r>
@@ -3508,24 +3484,14 @@
       <w:r>
         <w:t xml:space="preserve">Hình </w:t>
       </w:r>
-      <w:r>
-        <w:fldChar w:fldCharType="begin"/>
-      </w:r>
-      <w:r>
-        <w:instrText xml:space="preserve"> SEQ Hình \* ARABIC </w:instrText>
-      </w:r>
-      <w:r>
-        <w:fldChar w:fldCharType="separate"/>
-      </w:r>
-      <w:r>
-        <w:rPr>
-          <w:noProof/>
-        </w:rPr>
-        <w:t>3</w:t>
-      </w:r>
-      <w:r>
-        <w:fldChar w:fldCharType="end"/>
-      </w:r>
+      <w:fldSimple w:instr=" SEQ Hình \* ARABIC ">
+        <w:r>
+          <w:rPr>
+            <w:noProof/>
+          </w:rPr>
+          <w:t>3</w:t>
+        </w:r>
+      </w:fldSimple>
       <w:r>
         <w:rPr>
           <w:lang w:val="vi-VN"/>
@@ -4302,24 +4268,14 @@
       <w:r>
         <w:t xml:space="preserve">Hình </w:t>
       </w:r>
-      <w:r>
-        <w:fldChar w:fldCharType="begin"/>
-      </w:r>
-      <w:r>
-        <w:instrText xml:space="preserve"> SEQ Hình \* ARABIC </w:instrText>
-      </w:r>
-      <w:r>
-        <w:fldChar w:fldCharType="separate"/>
-      </w:r>
-      <w:r>
-        <w:rPr>
-          <w:noProof/>
-        </w:rPr>
-        <w:t>4</w:t>
-      </w:r>
-      <w:r>
-        <w:fldChar w:fldCharType="end"/>
-      </w:r>
+      <w:fldSimple w:instr=" SEQ Hình \* ARABIC ">
+        <w:r>
+          <w:rPr>
+            <w:noProof/>
+          </w:rPr>
+          <w:t>4</w:t>
+        </w:r>
+      </w:fldSimple>
       <w:r>
         <w:rPr>
           <w:lang w:val="vi-VN"/>
@@ -4402,24 +4358,14 @@
       <w:r>
         <w:t xml:space="preserve">Hình </w:t>
       </w:r>
-      <w:r>
-        <w:fldChar w:fldCharType="begin"/>
-      </w:r>
-      <w:r>
-        <w:instrText xml:space="preserve"> SEQ Hình \* ARABIC </w:instrText>
-      </w:r>
-      <w:r>
-        <w:fldChar w:fldCharType="separate"/>
-      </w:r>
-      <w:r>
-        <w:rPr>
-          <w:noProof/>
-        </w:rPr>
-        <w:t>5</w:t>
-      </w:r>
-      <w:r>
-        <w:fldChar w:fldCharType="end"/>
-      </w:r>
+      <w:fldSimple w:instr=" SEQ Hình \* ARABIC ">
+        <w:r>
+          <w:rPr>
+            <w:noProof/>
+          </w:rPr>
+          <w:t>5</w:t>
+        </w:r>
+      </w:fldSimple>
       <w:r>
         <w:rPr>
           <w:lang w:val="vi-VN"/>
@@ -4630,7 +4576,7 @@
           <w:szCs w:val="24"/>
         </w:rPr>
         <w:pict w14:anchorId="55DD17F5">
-          <v:rect id="_x0000_i1044" style="width:0;height:1.5pt" o:hrstd="t" o:hr="t" fillcolor="#a0a0a0" stroked="f"/>
+          <v:rect id="_x0000_i1025" style="width:0;height:1.5pt" o:hrstd="t" o:hr="t" fillcolor="#a0a0a0" stroked="f"/>
         </w:pict>
       </w:r>
     </w:p>
@@ -4698,24 +4644,14 @@
       <w:r>
         <w:t xml:space="preserve">Hình </w:t>
       </w:r>
-      <w:r>
-        <w:fldChar w:fldCharType="begin"/>
-      </w:r>
-      <w:r>
-        <w:instrText xml:space="preserve"> SEQ Hình \* ARABIC </w:instrText>
-      </w:r>
-      <w:r>
-        <w:fldChar w:fldCharType="separate"/>
-      </w:r>
-      <w:r>
-        <w:rPr>
-          <w:noProof/>
-        </w:rPr>
-        <w:t>6</w:t>
-      </w:r>
-      <w:r>
-        <w:fldChar w:fldCharType="end"/>
-      </w:r>
+      <w:fldSimple w:instr=" SEQ Hình \* ARABIC ">
+        <w:r>
+          <w:rPr>
+            <w:noProof/>
+          </w:rPr>
+          <w:t>6</w:t>
+        </w:r>
+      </w:fldSimple>
       <w:r>
         <w:rPr>
           <w:lang w:val="vi-VN"/>
@@ -8126,6 +8062,7 @@
   <w:style w:type="character" w:default="1" w:styleId="DefaultParagraphFont">
     <w:name w:val="Default Paragraph Font"/>
     <w:uiPriority w:val="1"/>
+    <w:semiHidden/>
     <w:unhideWhenUsed/>
   </w:style>
   <w:style w:type="table" w:default="1" w:styleId="TableNormal">

</xml_diff>